<commit_message>
chore: Update `template.docx` and remove a temporary LibreOffice lock file.
</commit_message>
<xml_diff>
--- a/template.docx
+++ b/template.docx
@@ -10,8 +10,8 @@
       <w:footerReference w:type="default" r:id="rId9"/>
       <w:headerReference w:type="first" r:id="rId10"/>
       <w:footerReference w:type="first" r:id="rId11"/>
-      <w:pgSz w:w="12240" w:h="15840"/>
-      <w:pgMar w:top="1440" w:right="1440" w:bottom="1440" w:left="1440" w:header="708" w:footer="708" w:gutter="0"/>
+      <w:pgSz w:w="12240" w:h="15840" w:code="1"/>
+      <w:pgMar w:top="1440" w:right="1440" w:bottom="1440" w:left="1440" w:header="706" w:footer="706" w:gutter="0"/>
       <w:pgBorders w:offsetFrom="page">
         <w:top w:val="single" w:sz="24" w:space="30" w:color="7030A0"/>
         <w:left w:val="single" w:sz="24" w:space="30" w:color="7030A0"/>
@@ -19,6 +19,7 @@
         <w:right w:val="single" w:sz="24" w:space="30" w:color="7030A0"/>
       </w:pgBorders>
       <w:cols w:space="708"/>
+      <w:vAlign w:val="center"/>
       <w:docGrid w:linePitch="360"/>
     </w:sectPr>
   </w:body>

</xml_diff>